<commit_message>
final report add limitation
</commit_message>
<xml_diff>
--- a/final report/Bitcoin-Analytics-Capstone_Sp26-Team08_Final_Revised.docx
+++ b/final report/Bitcoin-Analytics-Capstone_Sp26-Team08_Final_Revised.docx
@@ -148,6 +148,14 @@
     </w:p>
     <w:sdt>
       <w:sdtPr>
+        <w:rPr>
+          <w:rFonts w:ascii="Aptos" w:eastAsia="Aptos" w:hAnsi="Aptos" w:cstheme="minorBidi"/>
+          <w:b w:val="0"/>
+          <w:bCs w:val="0"/>
+          <w:color w:val="auto"/>
+          <w:sz w:val="21"/>
+          <w:szCs w:val="22"/>
+        </w:rPr>
         <w:id w:val="-1291502088"/>
         <w:docPartObj>
           <w:docPartGallery w:val="Table of Contents"/>
@@ -156,11 +164,7 @@
       </w:sdtPr>
       <w:sdtEndPr>
         <w:rPr>
-          <w:rFonts w:ascii="Aptos" w:eastAsia="Aptos" w:hAnsi="Aptos" w:cstheme="minorBidi"/>
           <w:noProof/>
-          <w:color w:val="auto"/>
-          <w:sz w:val="21"/>
-          <w:szCs w:val="22"/>
         </w:rPr>
       </w:sdtEndPr>
       <w:sdtContent>
@@ -2584,21 +2588,7 @@
           <w:rFonts w:ascii="Calibri" w:hAnsi="Calibri" w:cs="Calibri"/>
           <w:sz w:val="22"/>
         </w:rPr>
-        <w:t xml:space="preserve">The strongest result from our analysis is that valuation still matters most. Lower MVRV regimes were consistently associated with better accumulation outcomes. At the same time, the best entry windows were not usually the most extreme panic periods. They appeared more often in what we describe as an active churn regime: Bitcoin looked relatively undervalued, exchange </w:t>
-      </w:r>
-      <w:r>
-        <w:rPr>
-          <w:rFonts w:ascii="Calibri" w:hAnsi="Calibri" w:cs="Calibri"/>
-          <w:sz w:val="22"/>
-        </w:rPr>
-        <w:t>net flows</w:t>
-      </w:r>
-      <w:r>
-        <w:rPr>
-          <w:rFonts w:ascii="Calibri" w:hAnsi="Calibri" w:cs="Calibri"/>
-          <w:sz w:val="22"/>
-        </w:rPr>
-        <w:t xml:space="preserve"> showed moderate outflows, and on-chain participation remained healthy. This combination turned out to be more useful than looking at valuation in isolation.</w:t>
+        <w:t>The strongest result from our analysis is that valuation still matters most. Lower MVRV regimes were consistently associated with better accumulation outcomes. At the same time, the best entry windows were not usually the most extreme panic periods. They appeared more often in what we describe as an active churn regime: Bitcoin looked relatively undervalued, exchange net flows showed moderate outflows, and on-chain participation remained healthy. This combination turned out to be more useful than looking at valuation in isolation.</w:t>
       </w:r>
     </w:p>
     <w:p>
@@ -2688,6 +2678,7 @@
     </w:p>
     <w:p>
       <w:pPr>
+        <w:spacing w:after="240" w:line="240" w:lineRule="auto"/>
         <w:rPr>
           <w:rFonts w:asciiTheme="majorHAnsi" w:hAnsiTheme="majorHAnsi" w:cstheme="majorHAnsi"/>
           <w:sz w:val="22"/>
@@ -2717,6 +2708,7 @@
     </w:p>
     <w:p>
       <w:pPr>
+        <w:spacing w:after="240" w:line="240" w:lineRule="auto"/>
         <w:rPr>
           <w:rFonts w:asciiTheme="majorHAnsi" w:hAnsiTheme="majorHAnsi" w:cstheme="majorHAnsi"/>
           <w:sz w:val="22"/>
@@ -2727,32 +2719,35 @@
           <w:rFonts w:asciiTheme="majorHAnsi" w:hAnsiTheme="majorHAnsi" w:cstheme="majorHAnsi"/>
           <w:sz w:val="22"/>
         </w:rPr>
-        <w:t>In the world of bitcoin and crypto investment, this</w:t>
-      </w:r>
-      <w:r>
+        <w:t>In the world of bitcoin and crypto investment, this creates a useful business question: can a disciplined investor preserve the simplicity of DCA while improving capital timing through transparent signals? A positive answer matters because even modest improvements in bitcoin accumulated per dollar compound meaningfully over multi-year horizons. An accumulation strategy that buys slightly more aggressively when the asset is structurally cheap and slightly less aggressively when conditions are unfavorable can potentially improve long-run holdings without requiring leverage, discretionary timing, or black-box prediction.</w:t>
+      </w:r>
+    </w:p>
+    <w:p>
+      <w:pPr>
+        <w:spacing w:after="240" w:line="240" w:lineRule="auto"/>
         <w:rPr>
           <w:rFonts w:asciiTheme="majorHAnsi" w:hAnsiTheme="majorHAnsi" w:cstheme="majorHAnsi"/>
           <w:sz w:val="22"/>
         </w:rPr>
-        <w:t xml:space="preserve"> creates a useful business question: can a disciplined investor preserve the simplicity of DCA while improving capital timing through transparent signals? A positive answer matters because even modest improvements in </w:t>
-      </w:r>
+      </w:pPr>
       <w:r>
         <w:rPr>
           <w:rFonts w:asciiTheme="majorHAnsi" w:hAnsiTheme="majorHAnsi" w:cstheme="majorHAnsi"/>
           <w:sz w:val="22"/>
         </w:rPr>
-        <w:t>bitcoin</w:t>
+        <w:t xml:space="preserve">This framing also fits a realistic product perspective. The output of the model is not a trading signal such as 'buy' or 'sell' for a fully invested portfolio. </w:t>
       </w:r>
       <w:r>
         <w:rPr>
           <w:rFonts w:asciiTheme="majorHAnsi" w:hAnsiTheme="majorHAnsi" w:cstheme="majorHAnsi"/>
           <w:sz w:val="22"/>
         </w:rPr>
-        <w:t xml:space="preserve"> accumulated per dollar compound meaningfully over multi-year horizons. An accumulation strategy that buys slightly more aggressively when the asset is structurally cheap and slightly less aggressively when conditions are unfavorable can potentially improve long-run holdings without requiring leverage, discretionary timing, or black-box prediction.</w:t>
+        <w:t>Instead, it tells us periods that were more favorable for long-term accumulation and scale buying intensity up or down accordingly.</w:t>
       </w:r>
     </w:p>
     <w:p>
       <w:pPr>
+        <w:spacing w:after="240" w:line="240" w:lineRule="auto"/>
         <w:rPr>
           <w:rFonts w:asciiTheme="majorHAnsi" w:hAnsiTheme="majorHAnsi" w:cstheme="majorHAnsi"/>
           <w:sz w:val="22"/>
@@ -2763,83 +2758,61 @@
           <w:rFonts w:asciiTheme="majorHAnsi" w:hAnsiTheme="majorHAnsi" w:cstheme="majorHAnsi"/>
           <w:sz w:val="22"/>
         </w:rPr>
-        <w:t xml:space="preserve">This framing also fits a realistic product perspective. The output of the model is not a trading signal such as 'buy' or 'sell' for a fully invested portfolio. </w:t>
-      </w:r>
-      <w:r>
-        <w:rPr>
-          <w:rFonts w:asciiTheme="majorHAnsi" w:hAnsiTheme="majorHAnsi" w:cstheme="majorHAnsi"/>
-          <w:sz w:val="22"/>
-        </w:rPr>
-        <w:t>Instead, it tells us</w:t>
-      </w:r>
-      <w:r>
-        <w:rPr>
-          <w:rFonts w:asciiTheme="majorHAnsi" w:hAnsiTheme="majorHAnsi" w:cstheme="majorHAnsi"/>
-          <w:sz w:val="22"/>
-        </w:rPr>
-        <w:t xml:space="preserve"> periods that were more favorable for long-term accumulation and scale buying intensity up or down accordingly.</w:t>
+        <w:t>Our project answers below three research questions:</w:t>
       </w:r>
     </w:p>
     <w:p>
       <w:pPr>
-        <w:rPr>
-          <w:rFonts w:asciiTheme="majorHAnsi" w:hAnsiTheme="majorHAnsi" w:cstheme="majorHAnsi"/>
-          <w:sz w:val="22"/>
-        </w:rPr>
-      </w:pPr>
-      <w:r>
-        <w:rPr>
-          <w:rFonts w:asciiTheme="majorHAnsi" w:hAnsiTheme="majorHAnsi" w:cstheme="majorHAnsi"/>
-          <w:sz w:val="22"/>
-        </w:rPr>
-        <w:t>Our project answers below three research questions:</w:t>
+        <w:pStyle w:val="ListBullet"/>
+        <w:spacing w:after="240" w:line="240" w:lineRule="auto"/>
+        <w:rPr>
+          <w:rFonts w:ascii="Calibri" w:hAnsi="Calibri" w:cs="Calibri"/>
+        </w:rPr>
+      </w:pPr>
+      <w:r>
+        <w:rPr>
+          <w:rFonts w:ascii="Calibri" w:hAnsi="Calibri" w:cs="Calibri"/>
+        </w:rPr>
+        <w:t>Do on-chain valuation and participation indicators identify systematically better Bitcoin accumulation windows?</w:t>
       </w:r>
     </w:p>
     <w:p>
       <w:pPr>
         <w:pStyle w:val="ListBullet"/>
-        <w:rPr>
-          <w:rFonts w:ascii="Calibri" w:hAnsi="Calibri" w:cs="Calibri"/>
-        </w:rPr>
-      </w:pPr>
-      <w:r>
-        <w:rPr>
-          <w:rFonts w:ascii="Calibri" w:hAnsi="Calibri" w:cs="Calibri"/>
-        </w:rPr>
-        <w:t>Do on-chain valuation and participation indicators identify systematically better Bitcoin accumulation windows?</w:t>
+        <w:spacing w:after="240" w:line="240" w:lineRule="auto"/>
+        <w:rPr>
+          <w:rFonts w:ascii="Calibri" w:hAnsi="Calibri" w:cs="Calibri"/>
+        </w:rPr>
+      </w:pPr>
+      <w:r>
+        <w:rPr>
+          <w:rFonts w:ascii="Calibri" w:hAnsi="Calibri" w:cs="Calibri"/>
+        </w:rPr>
+        <w:t>Do prediction-market features from Polymarket add useful information about risk, sentiment, or speculative conviction?</w:t>
       </w:r>
     </w:p>
     <w:p>
       <w:pPr>
         <w:pStyle w:val="ListBullet"/>
-        <w:rPr>
-          <w:rFonts w:ascii="Calibri" w:hAnsi="Calibri" w:cs="Calibri"/>
-        </w:rPr>
-      </w:pPr>
-      <w:r>
-        <w:rPr>
-          <w:rFonts w:ascii="Calibri" w:hAnsi="Calibri" w:cs="Calibri"/>
-        </w:rPr>
-        <w:t>Do prediction-market features from Polymarket add useful information about risk, sentiment, or speculative conviction?</w:t>
+        <w:spacing w:after="240" w:line="240" w:lineRule="auto"/>
+        <w:rPr>
+          <w:rFonts w:ascii="Calibri" w:hAnsi="Calibri" w:cs="Calibri"/>
+        </w:rPr>
+      </w:pPr>
+      <w:r>
+        <w:rPr>
+          <w:rFonts w:ascii="Calibri" w:hAnsi="Calibri" w:cs="Calibri"/>
+        </w:rPr>
+        <w:t>Can a rule-based dynamic allocation framework outperform uniform DCA on a rolling out-of-sample style backtest while remaining interpretable?</w:t>
       </w:r>
     </w:p>
     <w:p>
       <w:pPr>
         <w:pStyle w:val="ListBullet"/>
-        <w:rPr>
-          <w:rFonts w:ascii="Calibri" w:hAnsi="Calibri" w:cs="Calibri"/>
-        </w:rPr>
-      </w:pPr>
-      <w:r>
-        <w:rPr>
-          <w:rFonts w:ascii="Calibri" w:hAnsi="Calibri" w:cs="Calibri"/>
-        </w:rPr>
-        <w:t>Can a rule-based dynamic allocation framework outperform uniform DCA on a rolling out-of-sample style backtest while remaining interpretable?</w:t>
-      </w:r>
-    </w:p>
-    <w:p>
-      <w:pPr>
-        <w:pStyle w:val="ListBullet"/>
+        <w:numPr>
+          <w:ilvl w:val="0"/>
+          <w:numId w:val="0"/>
+        </w:numPr>
         <w:rPr>
           <w:rFonts w:ascii="Calibri" w:hAnsi="Calibri" w:cs="Calibri"/>
         </w:rPr>
@@ -3015,6 +2988,19 @@
     </w:p>
     <w:p>
       <w:pPr>
+        <w:pStyle w:val="ListBullet"/>
+        <w:numPr>
+          <w:ilvl w:val="0"/>
+          <w:numId w:val="0"/>
+        </w:numPr>
+        <w:ind w:left="360" w:hanging="360"/>
+        <w:rPr>
+          <w:rFonts w:ascii="Calibri" w:hAnsi="Calibri" w:cs="Calibri"/>
+        </w:rPr>
+      </w:pPr>
+    </w:p>
+    <w:p>
+      <w:pPr>
         <w:pStyle w:val="Heading1"/>
         <w:rPr>
           <w:rFonts w:ascii="Calibri" w:hAnsi="Calibri" w:cs="Calibri"/>
@@ -3058,14 +3044,7 @@
           <w:rFonts w:ascii="Calibri" w:hAnsi="Calibri" w:cs="Calibri"/>
           <w:sz w:val="22"/>
         </w:rPr>
-        <w:t xml:space="preserve">The project uses two main data sources. </w:t>
-      </w:r>
-      <w:r>
-        <w:rPr>
-          <w:rFonts w:ascii="Calibri" w:hAnsi="Calibri" w:cs="Calibri"/>
-          <w:sz w:val="22"/>
-        </w:rPr>
-        <w:t>The</w:t>
+        <w:t>The project uses two main data sources. The</w:t>
       </w:r>
       <w:r>
         <w:rPr>
@@ -3880,7 +3859,19 @@
           <w:rFonts w:ascii="Calibri" w:hAnsi="Calibri" w:cs="Calibri"/>
         </w:rPr>
         <w:lastRenderedPageBreak/>
-        <w:t>3.3 Signal 3 — whale smart money</w:t>
+        <w:t>3.3 Signal 3</w:t>
+      </w:r>
+      <w:r>
+        <w:rPr>
+          <w:rFonts w:ascii="Calibri" w:hAnsi="Calibri" w:cs="Calibri"/>
+        </w:rPr>
+        <w:t xml:space="preserve"> - </w:t>
+      </w:r>
+      <w:r>
+        <w:rPr>
+          <w:rFonts w:ascii="Calibri" w:hAnsi="Calibri" w:cs="Calibri"/>
+        </w:rPr>
+        <w:t>smart money</w:t>
       </w:r>
       <w:bookmarkEnd w:id="10"/>
     </w:p>
@@ -3998,13 +3989,6 @@
           <w:sz w:val="22"/>
         </w:rPr>
       </w:pPr>
-      <w:r>
-        <w:rPr>
-          <w:rFonts w:ascii="Calibri" w:hAnsi="Calibri" w:cs="Calibri"/>
-          <w:sz w:val="22"/>
-        </w:rPr>
-        <w:t xml:space="preserve"> </w:t>
-      </w:r>
       <w:r>
         <w:rPr>
           <w:rFonts w:ascii="Calibri" w:hAnsi="Calibri" w:cs="Calibri"/>
@@ -4328,19 +4312,7 @@
         <w:rPr>
           <w:rFonts w:ascii="Calibri" w:hAnsi="Calibri" w:cs="Calibri"/>
         </w:rPr>
-        <w:t xml:space="preserve">Figure </w:t>
-      </w:r>
-      <w:r>
-        <w:rPr>
-          <w:rFonts w:ascii="Calibri" w:hAnsi="Calibri" w:cs="Calibri"/>
-        </w:rPr>
-        <w:t>9</w:t>
-      </w:r>
-      <w:r>
-        <w:rPr>
-          <w:rFonts w:ascii="Calibri" w:hAnsi="Calibri" w:cs="Calibri"/>
-        </w:rPr>
-        <w:t>. The prediction-market risk index functioned mainly as a regime filter, helping distinguish between different macro uncertainty environments.</w:t>
+        <w:t>Figure 9. The prediction-market risk index functioned mainly as a regime filter, helping distinguish between different macro uncertainty environments.</w:t>
       </w:r>
     </w:p>
     <w:p>
@@ -4866,14 +4838,7 @@
                 <w:rFonts w:ascii="Calibri" w:hAnsi="Calibri" w:cs="Calibri"/>
                 <w:sz w:val="22"/>
               </w:rPr>
-              <w:t xml:space="preserve">active addresses </w:t>
-            </w:r>
-            <w:r>
-              <w:rPr>
-                <w:rFonts w:ascii="Calibri" w:hAnsi="Calibri" w:cs="Calibri"/>
-                <w:sz w:val="22"/>
-              </w:rPr>
-              <w:t>indicate</w:t>
+              <w:t>active addresses indicate</w:t>
             </w:r>
             <w:r>
               <w:rPr>
@@ -5413,13 +5378,19 @@
               <w:spacing w:before="40" w:after="40"/>
               <w:rPr>
                 <w:rFonts w:ascii="Calibri" w:hAnsi="Calibri" w:cs="Calibri"/>
-                <w:sz w:val="18"/>
+                <w:b/>
+                <w:bCs/>
+                <w:sz w:val="20"/>
+                <w:szCs w:val="24"/>
               </w:rPr>
             </w:pPr>
             <w:r>
               <w:rPr>
                 <w:rFonts w:ascii="Calibri" w:hAnsi="Calibri" w:cs="Calibri"/>
-                <w:sz w:val="18"/>
+                <w:b/>
+                <w:bCs/>
+                <w:sz w:val="20"/>
+                <w:szCs w:val="24"/>
               </w:rPr>
               <w:t>Final Model Score</w:t>
             </w:r>
@@ -5439,6 +5410,7 @@
           <w:p>
             <w:pPr>
               <w:spacing w:before="40" w:after="40"/>
+              <w:jc w:val="center"/>
               <w:rPr>
                 <w:rFonts w:ascii="Calibri" w:hAnsi="Calibri" w:cs="Calibri"/>
                 <w:sz w:val="18"/>
@@ -5467,6 +5439,7 @@
           <w:p>
             <w:pPr>
               <w:spacing w:before="40" w:after="40"/>
+              <w:jc w:val="center"/>
               <w:rPr>
                 <w:rFonts w:ascii="Calibri" w:hAnsi="Calibri" w:cs="Calibri"/>
                 <w:sz w:val="18"/>
@@ -5495,6 +5468,7 @@
           <w:p>
             <w:pPr>
               <w:spacing w:before="40" w:after="40"/>
+              <w:jc w:val="center"/>
               <w:rPr>
                 <w:rFonts w:ascii="Calibri" w:hAnsi="Calibri" w:cs="Calibri"/>
                 <w:sz w:val="18"/>
@@ -5531,13 +5505,19 @@
               <w:spacing w:before="40" w:after="40"/>
               <w:rPr>
                 <w:rFonts w:ascii="Calibri" w:hAnsi="Calibri" w:cs="Calibri"/>
-                <w:sz w:val="18"/>
+                <w:b/>
+                <w:bCs/>
+                <w:sz w:val="20"/>
+                <w:szCs w:val="24"/>
               </w:rPr>
             </w:pPr>
             <w:r>
               <w:rPr>
                 <w:rFonts w:ascii="Calibri" w:hAnsi="Calibri" w:cs="Calibri"/>
-                <w:sz w:val="18"/>
+                <w:b/>
+                <w:bCs/>
+                <w:sz w:val="20"/>
+                <w:szCs w:val="24"/>
               </w:rPr>
               <w:t>Win Rate</w:t>
             </w:r>
@@ -5557,6 +5537,7 @@
           <w:p>
             <w:pPr>
               <w:spacing w:before="40" w:after="40"/>
+              <w:jc w:val="center"/>
               <w:rPr>
                 <w:rFonts w:ascii="Calibri" w:hAnsi="Calibri" w:cs="Calibri"/>
                 <w:sz w:val="18"/>
@@ -5585,6 +5566,7 @@
           <w:p>
             <w:pPr>
               <w:spacing w:before="40" w:after="40"/>
+              <w:jc w:val="center"/>
               <w:rPr>
                 <w:rFonts w:ascii="Calibri" w:hAnsi="Calibri" w:cs="Calibri"/>
                 <w:sz w:val="18"/>
@@ -5613,6 +5595,7 @@
           <w:p>
             <w:pPr>
               <w:spacing w:before="40" w:after="40"/>
+              <w:jc w:val="center"/>
               <w:rPr>
                 <w:rFonts w:ascii="Calibri" w:hAnsi="Calibri" w:cs="Calibri"/>
                 <w:sz w:val="18"/>
@@ -5649,13 +5632,19 @@
               <w:spacing w:before="40" w:after="40"/>
               <w:rPr>
                 <w:rFonts w:ascii="Calibri" w:hAnsi="Calibri" w:cs="Calibri"/>
-                <w:sz w:val="18"/>
+                <w:b/>
+                <w:bCs/>
+                <w:sz w:val="20"/>
+                <w:szCs w:val="24"/>
               </w:rPr>
             </w:pPr>
             <w:r>
               <w:rPr>
                 <w:rFonts w:ascii="Calibri" w:hAnsi="Calibri" w:cs="Calibri"/>
-                <w:sz w:val="18"/>
+                <w:b/>
+                <w:bCs/>
+                <w:sz w:val="20"/>
+                <w:szCs w:val="24"/>
               </w:rPr>
               <w:t>Exponential Decay Percentile</w:t>
             </w:r>
@@ -5675,6 +5664,7 @@
           <w:p>
             <w:pPr>
               <w:spacing w:before="40" w:after="40"/>
+              <w:jc w:val="center"/>
               <w:rPr>
                 <w:rFonts w:ascii="Calibri" w:hAnsi="Calibri" w:cs="Calibri"/>
                 <w:sz w:val="18"/>
@@ -5703,6 +5693,7 @@
           <w:p>
             <w:pPr>
               <w:spacing w:before="40" w:after="40"/>
+              <w:jc w:val="center"/>
               <w:rPr>
                 <w:rFonts w:ascii="Calibri" w:hAnsi="Calibri" w:cs="Calibri"/>
                 <w:sz w:val="18"/>
@@ -5731,6 +5722,7 @@
           <w:p>
             <w:pPr>
               <w:spacing w:before="40" w:after="40"/>
+              <w:jc w:val="center"/>
               <w:rPr>
                 <w:rFonts w:ascii="Calibri" w:hAnsi="Calibri" w:cs="Calibri"/>
                 <w:sz w:val="18"/>
@@ -5767,13 +5759,19 @@
               <w:spacing w:before="40" w:after="40"/>
               <w:rPr>
                 <w:rFonts w:ascii="Calibri" w:hAnsi="Calibri" w:cs="Calibri"/>
-                <w:sz w:val="18"/>
+                <w:b/>
+                <w:bCs/>
+                <w:sz w:val="20"/>
+                <w:szCs w:val="24"/>
               </w:rPr>
             </w:pPr>
             <w:r>
               <w:rPr>
                 <w:rFonts w:ascii="Calibri" w:hAnsi="Calibri" w:cs="Calibri"/>
-                <w:sz w:val="18"/>
+                <w:b/>
+                <w:bCs/>
+                <w:sz w:val="20"/>
+                <w:szCs w:val="24"/>
               </w:rPr>
               <w:t>Mean Excess Percentile</w:t>
             </w:r>
@@ -5793,6 +5791,7 @@
           <w:p>
             <w:pPr>
               <w:spacing w:before="40" w:after="40"/>
+              <w:jc w:val="center"/>
               <w:rPr>
                 <w:rFonts w:ascii="Calibri" w:hAnsi="Calibri" w:cs="Calibri"/>
                 <w:sz w:val="18"/>
@@ -5821,6 +5820,7 @@
           <w:p>
             <w:pPr>
               <w:spacing w:before="40" w:after="40"/>
+              <w:jc w:val="center"/>
               <w:rPr>
                 <w:rFonts w:ascii="Calibri" w:hAnsi="Calibri" w:cs="Calibri"/>
                 <w:sz w:val="18"/>
@@ -5849,6 +5849,7 @@
           <w:p>
             <w:pPr>
               <w:spacing w:before="40" w:after="40"/>
+              <w:jc w:val="center"/>
               <w:rPr>
                 <w:rFonts w:ascii="Calibri" w:hAnsi="Calibri" w:cs="Calibri"/>
                 <w:sz w:val="18"/>
@@ -5885,13 +5886,19 @@
               <w:spacing w:before="40" w:after="40"/>
               <w:rPr>
                 <w:rFonts w:ascii="Calibri" w:hAnsi="Calibri" w:cs="Calibri"/>
-                <w:sz w:val="18"/>
+                <w:b/>
+                <w:bCs/>
+                <w:sz w:val="20"/>
+                <w:szCs w:val="24"/>
               </w:rPr>
             </w:pPr>
             <w:r>
               <w:rPr>
                 <w:rFonts w:ascii="Calibri" w:hAnsi="Calibri" w:cs="Calibri"/>
-                <w:sz w:val="18"/>
+                <w:b/>
+                <w:bCs/>
+                <w:sz w:val="20"/>
+                <w:szCs w:val="24"/>
               </w:rPr>
               <w:t>Median Excess Percentile</w:t>
             </w:r>
@@ -5911,6 +5918,7 @@
           <w:p>
             <w:pPr>
               <w:spacing w:before="40" w:after="40"/>
+              <w:jc w:val="center"/>
               <w:rPr>
                 <w:rFonts w:ascii="Calibri" w:hAnsi="Calibri" w:cs="Calibri"/>
                 <w:sz w:val="18"/>
@@ -5939,6 +5947,7 @@
           <w:p>
             <w:pPr>
               <w:spacing w:before="40" w:after="40"/>
+              <w:jc w:val="center"/>
               <w:rPr>
                 <w:rFonts w:ascii="Calibri" w:hAnsi="Calibri" w:cs="Calibri"/>
                 <w:sz w:val="18"/>
@@ -5967,6 +5976,7 @@
           <w:p>
             <w:pPr>
               <w:spacing w:before="40" w:after="40"/>
+              <w:jc w:val="center"/>
               <w:rPr>
                 <w:rFonts w:ascii="Calibri" w:hAnsi="Calibri" w:cs="Calibri"/>
                 <w:sz w:val="18"/>
@@ -6003,13 +6013,19 @@
               <w:spacing w:before="40" w:after="40"/>
               <w:rPr>
                 <w:rFonts w:ascii="Calibri" w:hAnsi="Calibri" w:cs="Calibri"/>
-                <w:sz w:val="18"/>
+                <w:b/>
+                <w:bCs/>
+                <w:sz w:val="20"/>
+                <w:szCs w:val="24"/>
               </w:rPr>
             </w:pPr>
             <w:r>
               <w:rPr>
                 <w:rFonts w:ascii="Calibri" w:hAnsi="Calibri" w:cs="Calibri"/>
-                <w:sz w:val="18"/>
+                <w:b/>
+                <w:bCs/>
+                <w:sz w:val="20"/>
+                <w:szCs w:val="24"/>
               </w:rPr>
               <w:t>Mean Relative Improvement</w:t>
             </w:r>
@@ -6029,6 +6045,7 @@
           <w:p>
             <w:pPr>
               <w:spacing w:before="40" w:after="40"/>
+              <w:jc w:val="center"/>
               <w:rPr>
                 <w:rFonts w:ascii="Calibri" w:hAnsi="Calibri" w:cs="Calibri"/>
                 <w:sz w:val="18"/>
@@ -6057,6 +6074,7 @@
           <w:p>
             <w:pPr>
               <w:spacing w:before="40" w:after="40"/>
+              <w:jc w:val="center"/>
               <w:rPr>
                 <w:rFonts w:ascii="Calibri" w:hAnsi="Calibri" w:cs="Calibri"/>
                 <w:sz w:val="18"/>
@@ -6085,6 +6103,7 @@
           <w:p>
             <w:pPr>
               <w:spacing w:before="40" w:after="40"/>
+              <w:jc w:val="center"/>
               <w:rPr>
                 <w:rFonts w:ascii="Calibri" w:hAnsi="Calibri" w:cs="Calibri"/>
                 <w:sz w:val="18"/>
@@ -6121,13 +6140,19 @@
               <w:spacing w:before="40" w:after="40"/>
               <w:rPr>
                 <w:rFonts w:ascii="Calibri" w:hAnsi="Calibri" w:cs="Calibri"/>
-                <w:sz w:val="18"/>
+                <w:b/>
+                <w:bCs/>
+                <w:sz w:val="20"/>
+                <w:szCs w:val="24"/>
               </w:rPr>
             </w:pPr>
             <w:r>
               <w:rPr>
                 <w:rFonts w:ascii="Calibri" w:hAnsi="Calibri" w:cs="Calibri"/>
-                <w:sz w:val="18"/>
+                <w:b/>
+                <w:bCs/>
+                <w:sz w:val="20"/>
+                <w:szCs w:val="24"/>
               </w:rPr>
               <w:t>Median Relative Improvement</w:t>
             </w:r>
@@ -6147,6 +6172,7 @@
           <w:p>
             <w:pPr>
               <w:spacing w:before="40" w:after="40"/>
+              <w:jc w:val="center"/>
               <w:rPr>
                 <w:rFonts w:ascii="Calibri" w:hAnsi="Calibri" w:cs="Calibri"/>
                 <w:sz w:val="18"/>
@@ -6175,6 +6201,7 @@
           <w:p>
             <w:pPr>
               <w:spacing w:before="40" w:after="40"/>
+              <w:jc w:val="center"/>
               <w:rPr>
                 <w:rFonts w:ascii="Calibri" w:hAnsi="Calibri" w:cs="Calibri"/>
                 <w:sz w:val="18"/>
@@ -6203,6 +6230,7 @@
           <w:p>
             <w:pPr>
               <w:spacing w:before="40" w:after="40"/>
+              <w:jc w:val="center"/>
               <w:rPr>
                 <w:rFonts w:ascii="Calibri" w:hAnsi="Calibri" w:cs="Calibri"/>
                 <w:sz w:val="18"/>
@@ -6239,13 +6267,19 @@
               <w:spacing w:before="40" w:after="40"/>
               <w:rPr>
                 <w:rFonts w:ascii="Calibri" w:hAnsi="Calibri" w:cs="Calibri"/>
-                <w:sz w:val="18"/>
+                <w:b/>
+                <w:bCs/>
+                <w:sz w:val="20"/>
+                <w:szCs w:val="24"/>
               </w:rPr>
             </w:pPr>
             <w:r>
               <w:rPr>
                 <w:rFonts w:ascii="Calibri" w:hAnsi="Calibri" w:cs="Calibri"/>
-                <w:sz w:val="18"/>
+                <w:b/>
+                <w:bCs/>
+                <w:sz w:val="20"/>
+                <w:szCs w:val="24"/>
               </w:rPr>
               <w:t>Mean Ratio (Dynamic/Uniform)</w:t>
             </w:r>
@@ -6265,6 +6299,7 @@
           <w:p>
             <w:pPr>
               <w:spacing w:before="40" w:after="40"/>
+              <w:jc w:val="center"/>
               <w:rPr>
                 <w:rFonts w:ascii="Calibri" w:hAnsi="Calibri" w:cs="Calibri"/>
                 <w:sz w:val="18"/>
@@ -6293,6 +6328,7 @@
           <w:p>
             <w:pPr>
               <w:spacing w:before="40" w:after="40"/>
+              <w:jc w:val="center"/>
               <w:rPr>
                 <w:rFonts w:ascii="Calibri" w:hAnsi="Calibri" w:cs="Calibri"/>
                 <w:sz w:val="18"/>
@@ -6321,6 +6357,7 @@
           <w:p>
             <w:pPr>
               <w:spacing w:before="40" w:after="40"/>
+              <w:jc w:val="center"/>
               <w:rPr>
                 <w:rFonts w:ascii="Calibri" w:hAnsi="Calibri" w:cs="Calibri"/>
                 <w:sz w:val="18"/>
@@ -6339,15 +6376,7 @@
     </w:tbl>
     <w:p>
       <w:pPr>
-        <w:rPr>
-          <w:rFonts w:ascii="Calibri" w:hAnsi="Calibri" w:cs="Calibri"/>
-          <w:sz w:val="22"/>
-          <w:szCs w:val="24"/>
-        </w:rPr>
-      </w:pPr>
-    </w:p>
-    <w:p>
-      <w:pPr>
+        <w:spacing w:before="120" w:after="120" w:line="240" w:lineRule="auto"/>
         <w:rPr>
           <w:rFonts w:ascii="Calibri" w:hAnsi="Calibri" w:cs="Calibri"/>
           <w:sz w:val="22"/>
@@ -6532,6 +6561,161 @@
     </w:p>
     <w:p>
       <w:pPr>
+        <w:pStyle w:val="NormalWeb"/>
+        <w:rPr>
+          <w:rFonts w:ascii="Calibri" w:eastAsia="Aptos" w:hAnsi="Calibri" w:cs="Calibri"/>
+          <w:sz w:val="22"/>
+          <w:lang w:val="en-US" w:eastAsia="en-US"/>
+        </w:rPr>
+      </w:pPr>
+      <w:r>
+        <w:rPr>
+          <w:rFonts w:ascii="Calibri" w:eastAsia="Aptos" w:hAnsi="Calibri" w:cs="Calibri"/>
+          <w:sz w:val="22"/>
+          <w:lang w:val="en-US" w:eastAsia="en-US"/>
+        </w:rPr>
+        <w:t>The most instructive period of underperformance occurs from late 2022 into early 2023, immediately after the FTX collapse and during the early recovery that followed. As shown in Figure X, the dynamic strategy’s SPD percentile falls sharply below the uniform DCA benchmark around the 2022–2023 window, before recovering later. This is not best understood as a case where the model simply “bought the wrong regime.” Instead, it reflects a regime-transition failure. By that stage, valuation signals such as MVRV were already indicating that Bitcoin had become historically cheap after the Terra/Luna and FTX dislocations, so the model correctly recognized deep undervaluation. However, the broader framework was intentionally designed to avoid buying too aggressively in unstable environments, and trend-sensitive components such as the 200-day moving average, together with macro and risk dampeners, were still suppressing allocations because the market continued to look fragile. As a result, the strategy remained too defensive during the first leg of the rebound.</w:t>
+      </w:r>
+    </w:p>
+    <w:p>
+      <w:pPr>
+        <w:pStyle w:val="NormalWeb"/>
+        <w:rPr>
+          <w:rFonts w:ascii="Calibri" w:eastAsia="Aptos" w:hAnsi="Calibri" w:cs="Calibri"/>
+          <w:sz w:val="22"/>
+          <w:lang w:val="en-US" w:eastAsia="en-US"/>
+        </w:rPr>
+      </w:pPr>
+      <w:r>
+        <w:rPr>
+          <w:rFonts w:ascii="Calibri" w:eastAsia="Aptos" w:hAnsi="Calibri" w:cs="Calibri"/>
+          <w:sz w:val="22"/>
+          <w:lang w:val="en-US" w:eastAsia="en-US"/>
+        </w:rPr>
+        <w:drawing>
+          <wp:inline distT="0" distB="0" distL="0" distR="0" wp14:anchorId="16E2A56D" wp14:editId="2D6FB404">
+            <wp:extent cx="6217920" cy="3018790"/>
+            <wp:effectExtent l="0" t="0" r="0" b="0"/>
+            <wp:docPr id="1509552464" name="Picture 1"/>
+            <wp:cNvGraphicFramePr>
+              <a:graphicFrameLocks xmlns:a="http://schemas.openxmlformats.org/drawingml/2006/main" noChangeAspect="1"/>
+            </wp:cNvGraphicFramePr>
+            <a:graphic xmlns:a="http://schemas.openxmlformats.org/drawingml/2006/main">
+              <a:graphicData uri="http://schemas.openxmlformats.org/drawingml/2006/picture">
+                <pic:pic xmlns:pic="http://schemas.openxmlformats.org/drawingml/2006/picture">
+                  <pic:nvPicPr>
+                    <pic:cNvPr id="1509552464" name=""/>
+                    <pic:cNvPicPr/>
+                  </pic:nvPicPr>
+                  <pic:blipFill>
+                    <a:blip r:embed="rId17"/>
+                    <a:stretch>
+                      <a:fillRect/>
+                    </a:stretch>
+                  </pic:blipFill>
+                  <pic:spPr>
+                    <a:xfrm>
+                      <a:off x="0" y="0"/>
+                      <a:ext cx="6217920" cy="3018790"/>
+                    </a:xfrm>
+                    <a:prstGeom prst="rect">
+                      <a:avLst/>
+                    </a:prstGeom>
+                  </pic:spPr>
+                </pic:pic>
+              </a:graphicData>
+            </a:graphic>
+          </wp:inline>
+        </w:drawing>
+      </w:r>
+    </w:p>
+    <w:p>
+      <w:pPr>
+        <w:pStyle w:val="FigureCaption"/>
+        <w:rPr>
+          <w:rFonts w:ascii="Calibri" w:hAnsi="Calibri" w:cs="Calibri"/>
+        </w:rPr>
+      </w:pPr>
+      <w:r>
+        <w:rPr>
+          <w:rFonts w:ascii="Calibri" w:hAnsi="Calibri" w:cs="Calibri"/>
+        </w:rPr>
+        <w:t xml:space="preserve">Figure </w:t>
+      </w:r>
+      <w:r>
+        <w:rPr>
+          <w:rFonts w:ascii="Calibri" w:hAnsi="Calibri" w:cs="Calibri"/>
+        </w:rPr>
+        <w:t>10</w:t>
+      </w:r>
+      <w:r>
+        <w:rPr>
+          <w:rFonts w:ascii="Calibri" w:hAnsi="Calibri" w:cs="Calibri"/>
+        </w:rPr>
+        <w:t xml:space="preserve">. The </w:t>
+      </w:r>
+      <w:r>
+        <w:rPr>
+          <w:rFonts w:ascii="Calibri" w:hAnsi="Calibri" w:cs="Calibri"/>
+        </w:rPr>
+        <w:t>Dynamic DCA underperformed uniform DCA around late 2022 to early 2033 amid FTXC crash</w:t>
+      </w:r>
+    </w:p>
+    <w:p>
+      <w:pPr>
+        <w:pStyle w:val="NormalWeb"/>
+        <w:rPr>
+          <w:rFonts w:ascii="Calibri" w:eastAsia="Aptos" w:hAnsi="Calibri" w:cs="Calibri"/>
+          <w:sz w:val="22"/>
+          <w:lang w:val="en-US" w:eastAsia="en-US"/>
+        </w:rPr>
+      </w:pPr>
+      <w:r>
+        <w:rPr>
+          <w:rFonts w:ascii="Calibri" w:eastAsia="Aptos" w:hAnsi="Calibri" w:cs="Calibri"/>
+          <w:sz w:val="22"/>
+          <w:lang w:val="en-US" w:eastAsia="en-US"/>
+        </w:rPr>
+        <w:t xml:space="preserve">This period is especially important for an accumulation framework because the earliest phase of recovery is often where front-loaded buying generates the greatest sats-per-dollar advantage. When the model waits for too much confirmation after a crash, it protects against catching a falling knife, but it also risks missing the cheap-to-neutral repricing window that matters most for long-run accumulation efficiency. In this sense, the late-2022 to early-2023 miss reveals a structural </w:t>
+      </w:r>
+      <w:proofErr w:type="spellStart"/>
+      <w:r>
+        <w:rPr>
+          <w:rFonts w:ascii="Calibri" w:eastAsia="Aptos" w:hAnsi="Calibri" w:cs="Calibri"/>
+          <w:sz w:val="22"/>
+          <w:lang w:val="en-US" w:eastAsia="en-US"/>
+        </w:rPr>
+        <w:t>tradeoff</w:t>
+      </w:r>
+      <w:proofErr w:type="spellEnd"/>
+      <w:r>
+        <w:rPr>
+          <w:rFonts w:ascii="Calibri" w:eastAsia="Aptos" w:hAnsi="Calibri" w:cs="Calibri"/>
+          <w:sz w:val="22"/>
+          <w:lang w:val="en-US" w:eastAsia="en-US"/>
+        </w:rPr>
+        <w:t xml:space="preserve"> in the design: the same safeguards that reduce overbuying during breakdowns can delay re-entry when the market begins to heal. The difficulty of this episode was amplified by the fact that participation and exchange-flow measures improved only gradually rather than decisively, making the rebound easy to misclassify as a false dawn. Because Polymarket data do not cover this period, the underperformance should be interpreted primarily as a limitation of the on-chain-plus-trend architecture rather than a failure of the later prediction-market overlays.</w:t>
+      </w:r>
+    </w:p>
+    <w:p>
+      <w:pPr>
+        <w:pStyle w:val="Heading2"/>
+        <w:rPr>
+          <w:rFonts w:ascii="Calibri" w:hAnsi="Calibri" w:cs="Calibri"/>
+        </w:rPr>
+      </w:pPr>
+      <w:bookmarkStart w:id="23" w:name="_Toc226762391"/>
+      <w:r>
+        <w:rPr>
+          <w:rFonts w:ascii="Calibri" w:hAnsi="Calibri" w:cs="Calibri"/>
+        </w:rPr>
+        <w:lastRenderedPageBreak/>
+        <w:t>6.2 Iterative fixes we considered</w:t>
+      </w:r>
+      <w:bookmarkEnd w:id="23"/>
+    </w:p>
+    <w:p>
+      <w:pPr>
         <w:rPr>
           <w:rFonts w:ascii="Calibri" w:hAnsi="Calibri" w:cs="Calibri"/>
           <w:sz w:val="22"/>
@@ -6544,43 +6728,44 @@
           <w:sz w:val="22"/>
           <w:szCs w:val="24"/>
         </w:rPr>
-        <w:t>The most instructive underperformance occurs during the transition from late 2022 into early 2023. This was not a classic 'strategy failed during a euphoric top' problem. It was a regime-transition problem. Bitcoin had already become cheap by valuation metrics after the 2022 drawdown</w:t>
-      </w:r>
-      <w:r>
+        <w:t>The troubleshooting phase focused on whether the model should buy more aggressively when Bitcoin is deeply undervalued even if trend measures remain bearish. One attempted idea was to damp the moving-average influence when MVRV indicated very cheap conditions. The logic was that in capitulation-to-recovery phases, trend can lag too much and suppress needed buying.</w:t>
+      </w:r>
+    </w:p>
+    <w:p>
+      <w:pPr>
         <w:rPr>
           <w:rFonts w:ascii="Calibri" w:hAnsi="Calibri" w:cs="Calibri"/>
           <w:sz w:val="22"/>
           <w:szCs w:val="24"/>
         </w:rPr>
-        <w:t xml:space="preserve"> including Terra/Luna Collapse and FTX </w:t>
-      </w:r>
+      </w:pPr>
       <w:r>
         <w:rPr>
           <w:rFonts w:ascii="Calibri" w:hAnsi="Calibri" w:cs="Calibri"/>
           <w:sz w:val="22"/>
           <w:szCs w:val="24"/>
         </w:rPr>
-        <w:t xml:space="preserve">Collapse, </w:t>
-      </w:r>
-      <w:r>
-        <w:rPr>
-          <w:rFonts w:ascii="Calibri" w:hAnsi="Calibri" w:cs="Calibri"/>
+        <w:t>Conceptually, this is reasonable. In practice, the trade-off is delicate because reducing the moving-average penalty too much can worsen performance in genuine false rebounds. Since the model normalizes weights within a window, any extra allocation granted during one subperiod must come from another. A local fix to the 2022-2023 miss can therefore degrade broader performance if it overcorrects.</w:t>
+      </w:r>
+    </w:p>
+    <w:p>
+      <w:pPr>
+        <w:rPr>
           <w:sz w:val="22"/>
           <w:szCs w:val="24"/>
         </w:rPr>
-        <w:t>but</w:t>
-      </w:r>
-      <w:r>
-        <w:rPr>
-          <w:rFonts w:ascii="Calibri" w:hAnsi="Calibri" w:cs="Calibri"/>
+      </w:pPr>
+      <w:r>
+        <w:rPr>
           <w:sz w:val="22"/>
           <w:szCs w:val="24"/>
         </w:rPr>
-        <w:t xml:space="preserve"> the recovery phase began before the trend filters had fully repaired. In other words, value said 'start leaning in,' while trend and risk-aware dampeners still said 'be careful.'</w:t>
+        <w:t>Unsuccessful or only partially successful attempts</w:t>
       </w:r>
     </w:p>
     <w:p>
       <w:pPr>
+        <w:pStyle w:val="ListBullet"/>
         <w:rPr>
           <w:rFonts w:ascii="Calibri" w:hAnsi="Calibri" w:cs="Calibri"/>
           <w:sz w:val="22"/>
@@ -6593,22 +6778,25 @@
           <w:sz w:val="22"/>
           <w:szCs w:val="24"/>
         </w:rPr>
-        <w:t>The result was under-allocation during the first leg of the rebound. For an accumulation strategy, this is a subtle but important failure mode. If the model waits for too much confirmation after deep undervaluation, it misses the highest quality cheap-to-neutral repricing window. That is especially painful because early recoveries often generate large SPD benefits when buys are front-loaded appropriately.</w:t>
+        <w:t>Stronger MA dampening conditional on cheap MVRV: helped the missed rebound narrative but weakened overall robustness because it reduced the model's caution during other weak-trend periods.</w:t>
       </w:r>
     </w:p>
     <w:p>
       <w:pPr>
-        <w:rPr>
+        <w:pStyle w:val="ListBullet"/>
+        <w:rPr>
+          <w:rFonts w:ascii="Calibri" w:hAnsi="Calibri" w:cs="Calibri"/>
           <w:sz w:val="22"/>
           <w:szCs w:val="24"/>
         </w:rPr>
       </w:pPr>
       <w:r>
         <w:rPr>
+          <w:rFonts w:ascii="Calibri" w:hAnsi="Calibri" w:cs="Calibri"/>
           <w:sz w:val="22"/>
           <w:szCs w:val="24"/>
         </w:rPr>
-        <w:t>Why this period is difficult</w:t>
+        <w:t>Heavier direct reliance on Polymarket-derived modifiers: added complexity without broad enough historical coverage to justify larger weights.</w:t>
       </w:r>
     </w:p>
     <w:p>
@@ -6626,7 +6814,7 @@
           <w:sz w:val="22"/>
           <w:szCs w:val="24"/>
         </w:rPr>
-        <w:t>MVRV and other valuation measures correctly indicated cheapness, but price remained below the 200-day moving average for a prolonged period.</w:t>
+        <w:t>Using event activity as a direct upside predictor: the EDA did not support this; event intensity was more reliable as a downside-risk filter.</w:t>
       </w:r>
     </w:p>
     <w:p>
@@ -6644,43 +6832,7 @@
           <w:sz w:val="22"/>
           <w:szCs w:val="24"/>
         </w:rPr>
-        <w:t>The post-crash environment still looked fragile, so macro and trend-based dampeners continued to suppress position size.</w:t>
-      </w:r>
-    </w:p>
-    <w:p>
-      <w:pPr>
-        <w:pStyle w:val="ListBullet"/>
-        <w:rPr>
-          <w:rFonts w:ascii="Calibri" w:hAnsi="Calibri" w:cs="Calibri"/>
-          <w:sz w:val="22"/>
-          <w:szCs w:val="24"/>
-        </w:rPr>
-      </w:pPr>
-      <w:r>
-        <w:rPr>
-          <w:rFonts w:ascii="Calibri" w:hAnsi="Calibri" w:cs="Calibri"/>
-          <w:sz w:val="22"/>
-          <w:szCs w:val="24"/>
-        </w:rPr>
-        <w:t>Participation and flow measures improved gradually rather than explosively, making the recovery easy to misclassify as a false dawn.</w:t>
-      </w:r>
-    </w:p>
-    <w:p>
-      <w:pPr>
-        <w:pStyle w:val="ListBullet"/>
-        <w:rPr>
-          <w:rFonts w:ascii="Calibri" w:hAnsi="Calibri" w:cs="Calibri"/>
-          <w:sz w:val="22"/>
-          <w:szCs w:val="24"/>
-        </w:rPr>
-      </w:pPr>
-      <w:r>
-        <w:rPr>
-          <w:rFonts w:ascii="Calibri" w:hAnsi="Calibri" w:cs="Calibri"/>
-          <w:sz w:val="22"/>
-          <w:szCs w:val="24"/>
-        </w:rPr>
-        <w:t>Because Polymarket history does not cover that period, the miss is primarily a structural issue in the on-chain-plus-trend architecture rather than a failure of the later prediction-market overlays.</w:t>
+        <w:t>Over-amplifying whale-flow influence: recent data show some promise, but the short sample made large weights look statistically fragile.</w:t>
       </w:r>
     </w:p>
     <w:p>
@@ -6705,14 +6857,14 @@
           <w:rFonts w:ascii="Calibri" w:hAnsi="Calibri" w:cs="Calibri"/>
         </w:rPr>
       </w:pPr>
-      <w:bookmarkStart w:id="23" w:name="_Toc226762391"/>
-      <w:r>
-        <w:rPr>
-          <w:rFonts w:ascii="Calibri" w:hAnsi="Calibri" w:cs="Calibri"/>
-        </w:rPr>
-        <w:t>6.2 Iterative fixes we considered</w:t>
-      </w:r>
-      <w:bookmarkEnd w:id="23"/>
+      <w:bookmarkStart w:id="24" w:name="_Toc226762392"/>
+      <w:r>
+        <w:rPr>
+          <w:rFonts w:ascii="Calibri" w:hAnsi="Calibri" w:cs="Calibri"/>
+        </w:rPr>
+        <w:t>6.3 What the miss taught us</w:t>
+      </w:r>
+      <w:bookmarkEnd w:id="24"/>
     </w:p>
     <w:p>
       <w:pPr>
@@ -6728,13 +6880,117 @@
           <w:sz w:val="22"/>
           <w:szCs w:val="24"/>
         </w:rPr>
-        <w:t>The troubleshooting phase focused on whether the model should buy more aggressively when Bitcoin is deeply undervalued even if trend measures remain bearish. One attempted idea was to damp the moving-average influence when MVRV indicated very cheap conditions. The logic was that in capitulation-to-recovery phases, trend can lag too much and suppress needed buying.</w:t>
+        <w:t>The key lesson is that accumulation models should be designed to recognize phase changes, not only static cheapness or static trend. The hardest periods are not always obvious crashes; they are transitions where value has already improved but trend confirmation arrives late. This insight directly motivates future work on regime-switching logic and recovery-sensitive modifiers.</w:t>
       </w:r>
     </w:p>
     <w:p>
       <w:pPr>
         <w:rPr>
           <w:rFonts w:ascii="Calibri" w:hAnsi="Calibri" w:cs="Calibri"/>
+        </w:rPr>
+      </w:pPr>
+    </w:p>
+    <w:p>
+      <w:pPr>
+        <w:rPr>
+          <w:rFonts w:ascii="Calibri" w:hAnsi="Calibri" w:cs="Calibri"/>
+        </w:rPr>
+      </w:pPr>
+    </w:p>
+    <w:p>
+      <w:pPr>
+        <w:rPr>
+          <w:rFonts w:ascii="Calibri" w:hAnsi="Calibri" w:cs="Calibri"/>
+        </w:rPr>
+      </w:pPr>
+    </w:p>
+    <w:p>
+      <w:pPr>
+        <w:rPr>
+          <w:rFonts w:ascii="Calibri" w:hAnsi="Calibri" w:cs="Calibri"/>
+        </w:rPr>
+      </w:pPr>
+    </w:p>
+    <w:p>
+      <w:pPr>
+        <w:rPr>
+          <w:rFonts w:ascii="Calibri" w:hAnsi="Calibri" w:cs="Calibri"/>
+        </w:rPr>
+      </w:pPr>
+    </w:p>
+    <w:p>
+      <w:pPr>
+        <w:rPr>
+          <w:rFonts w:ascii="Calibri" w:hAnsi="Calibri" w:cs="Calibri"/>
+        </w:rPr>
+      </w:pPr>
+    </w:p>
+    <w:p>
+      <w:pPr>
+        <w:rPr>
+          <w:rFonts w:ascii="Calibri" w:hAnsi="Calibri" w:cs="Calibri"/>
+        </w:rPr>
+      </w:pPr>
+    </w:p>
+    <w:p>
+      <w:pPr>
+        <w:rPr>
+          <w:rFonts w:ascii="Calibri" w:hAnsi="Calibri" w:cs="Calibri"/>
+        </w:rPr>
+      </w:pPr>
+    </w:p>
+    <w:p>
+      <w:pPr>
+        <w:rPr>
+          <w:rFonts w:ascii="Calibri" w:hAnsi="Calibri" w:cs="Calibri"/>
+        </w:rPr>
+      </w:pPr>
+    </w:p>
+    <w:p>
+      <w:pPr>
+        <w:rPr>
+          <w:rFonts w:ascii="Calibri" w:hAnsi="Calibri" w:cs="Calibri"/>
+        </w:rPr>
+      </w:pPr>
+    </w:p>
+    <w:p>
+      <w:pPr>
+        <w:pStyle w:val="Heading1"/>
+        <w:rPr>
+          <w:rFonts w:ascii="Calibri" w:hAnsi="Calibri" w:cs="Calibri"/>
+        </w:rPr>
+      </w:pPr>
+      <w:bookmarkStart w:id="25" w:name="_Toc226762393"/>
+      <w:r>
+        <w:rPr>
+          <w:rFonts w:ascii="Calibri" w:hAnsi="Calibri" w:cs="Calibri"/>
+        </w:rPr>
+        <w:lastRenderedPageBreak/>
+        <w:t>7. Limitations, Future Work, and Lessons Learned</w:t>
+      </w:r>
+      <w:bookmarkEnd w:id="25"/>
+    </w:p>
+    <w:p>
+      <w:pPr>
+        <w:pStyle w:val="Heading2"/>
+        <w:rPr>
+          <w:rFonts w:ascii="Calibri" w:hAnsi="Calibri" w:cs="Calibri"/>
+        </w:rPr>
+      </w:pPr>
+      <w:bookmarkStart w:id="26" w:name="_Toc226762394"/>
+      <w:r>
+        <w:rPr>
+          <w:rFonts w:ascii="Calibri" w:hAnsi="Calibri" w:cs="Calibri"/>
+        </w:rPr>
+        <w:t>7.1 Limitations</w:t>
+      </w:r>
+      <w:bookmarkEnd w:id="26"/>
+    </w:p>
+    <w:p>
+      <w:pPr>
+        <w:pStyle w:val="ListBullet"/>
+        <w:rPr>
+          <w:rFonts w:ascii="Calibri" w:hAnsi="Calibri" w:cs="Calibri"/>
           <w:sz w:val="22"/>
           <w:szCs w:val="24"/>
         </w:rPr>
@@ -6745,22 +7001,49 @@
           <w:sz w:val="22"/>
           <w:szCs w:val="24"/>
         </w:rPr>
-        <w:t>Conceptually, this is reasonable. In practice, the trade-off is delicate because reducing the moving-average penalty too much can worsen performance in genuine false rebounds. Since the model normalizes weights within a window, any extra allocation granted during one subperiod must come from another. A local fix to the 2022-2023 miss can therefore degrade broader performance if it overcorrects.</w:t>
+        <w:t>The framework is rule-based and heuristically tuned rather than formally optimized.</w:t>
       </w:r>
     </w:p>
     <w:p>
       <w:pPr>
-        <w:rPr>
+        <w:pStyle w:val="ListBullet"/>
+        <w:rPr>
+          <w:rFonts w:ascii="Calibri" w:hAnsi="Calibri" w:cs="Calibri"/>
           <w:sz w:val="22"/>
           <w:szCs w:val="24"/>
         </w:rPr>
       </w:pPr>
       <w:r>
         <w:rPr>
+          <w:rFonts w:ascii="Calibri" w:hAnsi="Calibri" w:cs="Calibri"/>
           <w:sz w:val="22"/>
           <w:szCs w:val="24"/>
         </w:rPr>
-        <w:t>Unsuccessful or only partially successful attempts</w:t>
+        <w:t xml:space="preserve">Timeline mismatch: </w:t>
+      </w:r>
+      <w:r>
+        <w:rPr>
+          <w:rFonts w:ascii="Calibri" w:hAnsi="Calibri" w:cs="Calibri"/>
+          <w:sz w:val="22"/>
+          <w:szCs w:val="24"/>
+        </w:rPr>
+        <w:t xml:space="preserve">The Polymarket </w:t>
+      </w:r>
+      <w:r>
+        <w:rPr>
+          <w:rFonts w:ascii="Calibri" w:hAnsi="Calibri" w:cs="Calibri"/>
+          <w:sz w:val="22"/>
+          <w:szCs w:val="24"/>
+        </w:rPr>
+        <w:t xml:space="preserve">odd history used for risk regime modifier begins in 2023, while </w:t>
+      </w:r>
+      <w:r>
+        <w:rPr>
+          <w:rFonts w:ascii="Calibri" w:hAnsi="Calibri" w:cs="Calibri"/>
+          <w:sz w:val="22"/>
+          <w:szCs w:val="24"/>
+        </w:rPr>
+        <w:t>trades sample used for whale analysis begins only in 2025, which limits full-cycle validation.</w:t>
       </w:r>
     </w:p>
     <w:p>
@@ -6778,62 +7061,7 @@
           <w:sz w:val="22"/>
           <w:szCs w:val="24"/>
         </w:rPr>
-        <w:t>Stronger MA dampening conditional on cheap MVRV: helped the missed rebound narrative but weakened overall robustness because it reduced the model's caution during other weak-trend periods.</w:t>
-      </w:r>
-    </w:p>
-    <w:p>
-      <w:pPr>
-        <w:pStyle w:val="ListBullet"/>
-        <w:rPr>
-          <w:rFonts w:ascii="Calibri" w:hAnsi="Calibri" w:cs="Calibri"/>
-          <w:sz w:val="22"/>
-          <w:szCs w:val="24"/>
-        </w:rPr>
-      </w:pPr>
-      <w:r>
-        <w:rPr>
-          <w:rFonts w:ascii="Calibri" w:hAnsi="Calibri" w:cs="Calibri"/>
-          <w:sz w:val="22"/>
-          <w:szCs w:val="24"/>
-        </w:rPr>
-        <w:t>Heavier direct reliance on Polymarket-derived modifiers: added complexity without broad enough historical coverage to justify larger weights.</w:t>
-      </w:r>
-    </w:p>
-    <w:p>
-      <w:pPr>
-        <w:pStyle w:val="ListBullet"/>
-        <w:rPr>
-          <w:rFonts w:ascii="Calibri" w:hAnsi="Calibri" w:cs="Calibri"/>
-          <w:sz w:val="22"/>
-          <w:szCs w:val="24"/>
-        </w:rPr>
-      </w:pPr>
-      <w:r>
-        <w:rPr>
-          <w:rFonts w:ascii="Calibri" w:hAnsi="Calibri" w:cs="Calibri"/>
-          <w:sz w:val="22"/>
-          <w:szCs w:val="24"/>
-        </w:rPr>
-        <w:t>Using event activity as a direct upside predictor: the EDA did not support this; event intensity was more reliable as a downside-risk filter.</w:t>
-      </w:r>
-    </w:p>
-    <w:p>
-      <w:pPr>
-        <w:pStyle w:val="ListBullet"/>
-        <w:rPr>
-          <w:rFonts w:ascii="Calibri" w:hAnsi="Calibri" w:cs="Calibri"/>
-          <w:sz w:val="22"/>
-          <w:szCs w:val="24"/>
-        </w:rPr>
-      </w:pPr>
-      <w:r>
-        <w:rPr>
-          <w:rFonts w:ascii="Calibri" w:hAnsi="Calibri" w:cs="Calibri"/>
-          <w:sz w:val="22"/>
-          <w:szCs w:val="24"/>
-        </w:rPr>
-        <w:lastRenderedPageBreak/>
-        <w:t>Over-amplifying whale-flow influence: recent data show some promise, but the short sample made large weights look statistically fragile.</w:t>
+        <w:t>Some regime modifiers are empirically motivated but still relatively light-touch because a longer history is needed before treating them as primary pillars.</w:t>
       </w:r>
     </w:p>
     <w:p>
@@ -6846,286 +7074,6 @@
         <w:ind w:left="360"/>
         <w:rPr>
           <w:rFonts w:ascii="Calibri" w:hAnsi="Calibri" w:cs="Calibri"/>
-        </w:rPr>
-      </w:pPr>
-    </w:p>
-    <w:p>
-      <w:pPr>
-        <w:pStyle w:val="Heading2"/>
-        <w:rPr>
-          <w:rFonts w:ascii="Calibri" w:hAnsi="Calibri" w:cs="Calibri"/>
-        </w:rPr>
-      </w:pPr>
-      <w:bookmarkStart w:id="24" w:name="_Toc226762392"/>
-      <w:r>
-        <w:rPr>
-          <w:rFonts w:ascii="Calibri" w:hAnsi="Calibri" w:cs="Calibri"/>
-        </w:rPr>
-        <w:t>6.3 What the miss taught us</w:t>
-      </w:r>
-      <w:bookmarkEnd w:id="24"/>
-    </w:p>
-    <w:p>
-      <w:pPr>
-        <w:rPr>
-          <w:rFonts w:ascii="Calibri" w:hAnsi="Calibri" w:cs="Calibri"/>
-          <w:sz w:val="22"/>
-          <w:szCs w:val="24"/>
-        </w:rPr>
-      </w:pPr>
-      <w:r>
-        <w:rPr>
-          <w:rFonts w:ascii="Calibri" w:hAnsi="Calibri" w:cs="Calibri"/>
-          <w:sz w:val="22"/>
-          <w:szCs w:val="24"/>
-        </w:rPr>
-        <w:t>The key lesson is that accumulation models should be designed to recognize phase changes, not only static cheapness or static trend. The hardest periods are not always obvious crashes; they are transitions where value has already improved but trend confirmation arrives late. This insight directly motivates future work on regime-switching logic and recovery-sensitive modifiers.</w:t>
-      </w:r>
-    </w:p>
-    <w:p>
-      <w:pPr>
-        <w:rPr>
-          <w:rFonts w:ascii="Calibri" w:hAnsi="Calibri" w:cs="Calibri"/>
-        </w:rPr>
-      </w:pPr>
-    </w:p>
-    <w:p>
-      <w:pPr>
-        <w:rPr>
-          <w:rFonts w:ascii="Calibri" w:hAnsi="Calibri" w:cs="Calibri"/>
-        </w:rPr>
-      </w:pPr>
-    </w:p>
-    <w:p>
-      <w:pPr>
-        <w:rPr>
-          <w:rFonts w:ascii="Calibri" w:hAnsi="Calibri" w:cs="Calibri"/>
-        </w:rPr>
-      </w:pPr>
-    </w:p>
-    <w:p>
-      <w:pPr>
-        <w:rPr>
-          <w:rFonts w:ascii="Calibri" w:hAnsi="Calibri" w:cs="Calibri"/>
-        </w:rPr>
-      </w:pPr>
-    </w:p>
-    <w:p>
-      <w:pPr>
-        <w:rPr>
-          <w:rFonts w:ascii="Calibri" w:hAnsi="Calibri" w:cs="Calibri"/>
-        </w:rPr>
-      </w:pPr>
-    </w:p>
-    <w:p>
-      <w:pPr>
-        <w:rPr>
-          <w:rFonts w:ascii="Calibri" w:hAnsi="Calibri" w:cs="Calibri"/>
-        </w:rPr>
-      </w:pPr>
-    </w:p>
-    <w:p>
-      <w:pPr>
-        <w:rPr>
-          <w:rFonts w:ascii="Calibri" w:hAnsi="Calibri" w:cs="Calibri"/>
-        </w:rPr>
-      </w:pPr>
-    </w:p>
-    <w:p>
-      <w:pPr>
-        <w:rPr>
-          <w:rFonts w:ascii="Calibri" w:hAnsi="Calibri" w:cs="Calibri"/>
-        </w:rPr>
-      </w:pPr>
-    </w:p>
-    <w:p>
-      <w:pPr>
-        <w:rPr>
-          <w:rFonts w:ascii="Calibri" w:hAnsi="Calibri" w:cs="Calibri"/>
-        </w:rPr>
-      </w:pPr>
-    </w:p>
-    <w:p>
-      <w:pPr>
-        <w:rPr>
-          <w:rFonts w:ascii="Calibri" w:hAnsi="Calibri" w:cs="Calibri"/>
-        </w:rPr>
-      </w:pPr>
-    </w:p>
-    <w:p>
-      <w:pPr>
-        <w:rPr>
-          <w:rFonts w:ascii="Calibri" w:hAnsi="Calibri" w:cs="Calibri"/>
-        </w:rPr>
-      </w:pPr>
-    </w:p>
-    <w:p>
-      <w:pPr>
-        <w:rPr>
-          <w:rFonts w:ascii="Calibri" w:hAnsi="Calibri" w:cs="Calibri"/>
-        </w:rPr>
-      </w:pPr>
-    </w:p>
-    <w:p>
-      <w:pPr>
-        <w:rPr>
-          <w:rFonts w:ascii="Calibri" w:hAnsi="Calibri" w:cs="Calibri"/>
-        </w:rPr>
-      </w:pPr>
-    </w:p>
-    <w:p>
-      <w:pPr>
-        <w:rPr>
-          <w:rFonts w:ascii="Calibri" w:hAnsi="Calibri" w:cs="Calibri"/>
-        </w:rPr>
-      </w:pPr>
-    </w:p>
-    <w:p>
-      <w:pPr>
-        <w:rPr>
-          <w:rFonts w:ascii="Calibri" w:hAnsi="Calibri" w:cs="Calibri"/>
-        </w:rPr>
-      </w:pPr>
-    </w:p>
-    <w:p>
-      <w:pPr>
-        <w:rPr>
-          <w:rFonts w:ascii="Calibri" w:hAnsi="Calibri" w:cs="Calibri"/>
-        </w:rPr>
-      </w:pPr>
-    </w:p>
-    <w:p>
-      <w:pPr>
-        <w:rPr>
-          <w:rFonts w:ascii="Calibri" w:hAnsi="Calibri" w:cs="Calibri"/>
-        </w:rPr>
-      </w:pPr>
-    </w:p>
-    <w:p>
-      <w:pPr>
-        <w:rPr>
-          <w:rFonts w:ascii="Calibri" w:hAnsi="Calibri" w:cs="Calibri"/>
-        </w:rPr>
-      </w:pPr>
-    </w:p>
-    <w:p>
-      <w:pPr>
-        <w:rPr>
-          <w:rFonts w:ascii="Calibri" w:hAnsi="Calibri" w:cs="Calibri"/>
-        </w:rPr>
-      </w:pPr>
-    </w:p>
-    <w:p>
-      <w:pPr>
-        <w:rPr>
-          <w:rFonts w:ascii="Calibri" w:hAnsi="Calibri" w:cs="Calibri"/>
-        </w:rPr>
-      </w:pPr>
-    </w:p>
-    <w:p>
-      <w:pPr>
-        <w:rPr>
-          <w:rFonts w:ascii="Calibri" w:hAnsi="Calibri" w:cs="Calibri"/>
-        </w:rPr>
-      </w:pPr>
-    </w:p>
-    <w:p>
-      <w:pPr>
-        <w:pStyle w:val="Heading1"/>
-        <w:rPr>
-          <w:rFonts w:ascii="Calibri" w:hAnsi="Calibri" w:cs="Calibri"/>
-        </w:rPr>
-      </w:pPr>
-      <w:bookmarkStart w:id="25" w:name="_Toc226762393"/>
-      <w:r>
-        <w:rPr>
-          <w:rFonts w:ascii="Calibri" w:hAnsi="Calibri" w:cs="Calibri"/>
-        </w:rPr>
-        <w:lastRenderedPageBreak/>
-        <w:t>7. Limitations, Future Work, and Lessons Learned</w:t>
-      </w:r>
-      <w:bookmarkEnd w:id="25"/>
-    </w:p>
-    <w:p>
-      <w:pPr>
-        <w:pStyle w:val="Heading2"/>
-        <w:rPr>
-          <w:rFonts w:ascii="Calibri" w:hAnsi="Calibri" w:cs="Calibri"/>
-        </w:rPr>
-      </w:pPr>
-      <w:bookmarkStart w:id="26" w:name="_Toc226762394"/>
-      <w:r>
-        <w:rPr>
-          <w:rFonts w:ascii="Calibri" w:hAnsi="Calibri" w:cs="Calibri"/>
-        </w:rPr>
-        <w:t>7.1 Limitations</w:t>
-      </w:r>
-      <w:bookmarkEnd w:id="26"/>
-    </w:p>
-    <w:p>
-      <w:pPr>
-        <w:pStyle w:val="ListBullet"/>
-        <w:rPr>
-          <w:rFonts w:ascii="Calibri" w:hAnsi="Calibri" w:cs="Calibri"/>
-          <w:sz w:val="22"/>
-          <w:szCs w:val="24"/>
-        </w:rPr>
-      </w:pPr>
-      <w:r>
-        <w:rPr>
-          <w:rFonts w:ascii="Calibri" w:hAnsi="Calibri" w:cs="Calibri"/>
-          <w:sz w:val="22"/>
-          <w:szCs w:val="24"/>
-        </w:rPr>
-        <w:t>The framework is rule-based and heuristically tuned rather than formally optimized.</w:t>
-      </w:r>
-    </w:p>
-    <w:p>
-      <w:pPr>
-        <w:pStyle w:val="ListBullet"/>
-        <w:rPr>
-          <w:rFonts w:ascii="Calibri" w:hAnsi="Calibri" w:cs="Calibri"/>
-          <w:sz w:val="22"/>
-          <w:szCs w:val="24"/>
-        </w:rPr>
-      </w:pPr>
-      <w:r>
-        <w:rPr>
-          <w:rFonts w:ascii="Calibri" w:hAnsi="Calibri" w:cs="Calibri"/>
-          <w:sz w:val="22"/>
-          <w:szCs w:val="24"/>
-        </w:rPr>
-        <w:t>The Polymarket trades sample used for whale analysis begins only in 2025, which limits full-cycle validation.</w:t>
-      </w:r>
-    </w:p>
-    <w:p>
-      <w:pPr>
-        <w:pStyle w:val="ListBullet"/>
-        <w:rPr>
-          <w:rFonts w:ascii="Calibri" w:hAnsi="Calibri" w:cs="Calibri"/>
-          <w:sz w:val="22"/>
-          <w:szCs w:val="24"/>
-        </w:rPr>
-      </w:pPr>
-      <w:r>
-        <w:rPr>
-          <w:rFonts w:ascii="Calibri" w:hAnsi="Calibri" w:cs="Calibri"/>
-          <w:sz w:val="22"/>
-          <w:szCs w:val="24"/>
-        </w:rPr>
-        <w:t>Some regime modifiers are empirically motivated but still relatively light-touch because a longer history is needed before treating them as primary pillars.</w:t>
-      </w:r>
-    </w:p>
-    <w:p>
-      <w:pPr>
-        <w:pStyle w:val="ListBullet"/>
-        <w:numPr>
-          <w:ilvl w:val="0"/>
-          <w:numId w:val="0"/>
-        </w:numPr>
-        <w:ind w:left="360"/>
-        <w:rPr>
-          <w:rFonts w:ascii="Calibri" w:hAnsi="Calibri" w:cs="Calibri"/>
           <w:sz w:val="22"/>
           <w:szCs w:val="24"/>
         </w:rPr>
@@ -7163,16 +7111,14 @@
         </w:rPr>
         <w:t xml:space="preserve">A natural next extension is to make the weighting scheme more data-driven through machine learning rather than relying only on heuristic tuning. In the current framework, the signal weights were chosen through exploratory analysis, economic intuition, and repeated </w:t>
       </w:r>
-      <w:proofErr w:type="spellStart"/>
       <w:r>
         <w:rPr>
           <w:rFonts w:ascii="Calibri" w:hAnsi="Calibri" w:cs="Calibri"/>
           <w:sz w:val="22"/>
           <w:szCs w:val="24"/>
         </w:rPr>
-        <w:t>backtesting</w:t>
-      </w:r>
-      <w:proofErr w:type="spellEnd"/>
+        <w:t>back testing</w:t>
+      </w:r>
       <w:r>
         <w:rPr>
           <w:rFonts w:ascii="Calibri" w:hAnsi="Calibri" w:cs="Calibri"/>
@@ -7201,12 +7147,6 @@
     </w:p>
     <w:p>
       <w:pPr>
-        <w:pStyle w:val="ListBullet"/>
-        <w:numPr>
-          <w:ilvl w:val="0"/>
-          <w:numId w:val="0"/>
-        </w:numPr>
-        <w:ind w:left="360" w:hanging="360"/>
         <w:rPr>
           <w:rFonts w:ascii="Calibri" w:hAnsi="Calibri" w:cs="Calibri"/>
           <w:sz w:val="22"/>
@@ -7392,7 +7332,7 @@
                     <pic:cNvPicPr/>
                   </pic:nvPicPr>
                   <pic:blipFill>
-                    <a:blip r:embed="rId17"/>
+                    <a:blip r:embed="rId18"/>
                     <a:stretch>
                       <a:fillRect/>
                     </a:stretch>
@@ -7455,7 +7395,7 @@
                     <pic:cNvPicPr/>
                   </pic:nvPicPr>
                   <pic:blipFill>
-                    <a:blip r:embed="rId18"/>
+                    <a:blip r:embed="rId19"/>
                     <a:stretch>
                       <a:fillRect/>
                     </a:stretch>
@@ -7518,7 +7458,7 @@
                     <pic:cNvPicPr/>
                   </pic:nvPicPr>
                   <pic:blipFill>
-                    <a:blip r:embed="rId19"/>
+                    <a:blip r:embed="rId20"/>
                     <a:stretch>
                       <a:fillRect/>
                     </a:stretch>
@@ -7582,7 +7522,7 @@
                     <pic:cNvPicPr/>
                   </pic:nvPicPr>
                   <pic:blipFill>
-                    <a:blip r:embed="rId20"/>
+                    <a:blip r:embed="rId21"/>
                     <a:stretch>
                       <a:fillRect/>
                     </a:stretch>
@@ -7645,7 +7585,7 @@
                     <pic:cNvPicPr/>
                   </pic:nvPicPr>
                   <pic:blipFill>
-                    <a:blip r:embed="rId21"/>
+                    <a:blip r:embed="rId22"/>
                     <a:stretch>
                       <a:fillRect/>
                     </a:stretch>
@@ -7708,7 +7648,7 @@
                     <pic:cNvPicPr/>
                   </pic:nvPicPr>
                   <pic:blipFill>
-                    <a:blip r:embed="rId22"/>
+                    <a:blip r:embed="rId23"/>
                     <a:stretch>
                       <a:fillRect/>
                     </a:stretch>
@@ -7745,8 +7685,8 @@
       </w:r>
     </w:p>
     <w:sectPr>
-      <w:headerReference w:type="default" r:id="rId23"/>
-      <w:footerReference w:type="default" r:id="rId24"/>
+      <w:headerReference w:type="default" r:id="rId24"/>
+      <w:footerReference w:type="default" r:id="rId25"/>
       <w:pgSz w:w="12240" w:h="15840"/>
       <w:pgMar w:top="1080" w:right="1224" w:bottom="1008" w:left="1224" w:header="720" w:footer="720" w:gutter="0"/>
       <w:cols w:space="720"/>
@@ -8004,7 +7944,7 @@
   <w:abstractNum w:abstractNumId="8" w15:restartNumberingAfterBreak="0">
     <w:nsid w:val="FFFFFF89"/>
     <w:multiLevelType w:val="singleLevel"/>
-    <w:tmpl w:val="29761A62"/>
+    <w:tmpl w:val="D8BC532E"/>
     <w:lvl w:ilvl="0">
       <w:start w:val="1"/>
       <w:numFmt w:val="bullet"/>
@@ -19530,6 +19470,22 @@
       <w:u w:val="single"/>
     </w:rPr>
   </w:style>
+  <w:style w:type="paragraph" w:styleId="NormalWeb">
+    <w:name w:val="Normal (Web)"/>
+    <w:basedOn w:val="Normal"/>
+    <w:uiPriority w:val="99"/>
+    <w:unhideWhenUsed/>
+    <w:rsid w:val="001F73AE"/>
+    <w:pPr>
+      <w:spacing w:before="100" w:beforeAutospacing="1" w:after="100" w:afterAutospacing="1" w:line="240" w:lineRule="auto"/>
+    </w:pPr>
+    <w:rPr>
+      <w:rFonts w:ascii="Times New Roman" w:eastAsia="Times New Roman" w:hAnsi="Times New Roman" w:cs="Times New Roman"/>
+      <w:sz w:val="24"/>
+      <w:szCs w:val="24"/>
+      <w:lang w:val="en-HK" w:eastAsia="zh-CN"/>
+    </w:rPr>
+  </w:style>
 </w:styles>
 </file>
 

</xml_diff>